<commit_message>
Add confirmed honors, campus experience and expanded resume skills
</commit_message>
<xml_diff>
--- a/assets/resume/shi-jiawen-ai-product-resume-20261012.docx
+++ b/assets/resume/shi-jiawen-ai-product-resume-20261012.docx
@@ -32,7 +32,7 @@
         <w:rPr>
           <w:sz w:val="21"/>
         </w:rPr>
-        <w:t>北京｜13932349275｜shijiawenniu1@gmail.com</w:t>
+        <w:t>所在地 北京｜13932349275｜shijiawenniu1@gmail.com</w:t>
       </w:r>
     </w:p>
     <w:p>
@@ -519,10 +519,10 @@
         <w:rPr>
           <w:b/>
         </w:rPr>
-        <w:t>AI 辅助研发：</w:t>
+        <w:t>AI 辅助开发：</w:t>
       </w:r>
       <w:r>
-        <w:t>使用 Codex、Hermes、Superpowers 推进开发；具备前后端 AI 辅助实现、图像接口适配及 Supabase 使用实践。</w:t>
+        <w:t>使用 Codex、Hermes、Cursor、Superpowers 辅助方案验证与前后端开发；有 API 接口对接、图像模型接入及 Supabase 使用实践。</w:t>
       </w:r>
     </w:p>
     <w:p>
@@ -533,10 +533,10 @@
         <w:rPr>
           <w:b/>
         </w:rPr>
-        <w:t>Agent 与工具连接：</w:t>
+        <w:t>Agent 与自动化：</w:t>
       </w:r>
       <w:r>
-        <w:t>Agno、Agent Skills、MCP、n8n；编写过内容 Skill，通过 MCP 连接过微信发布相关工具及 Supabase，使用 n8n 采集信息。</w:t>
+        <w:t>使用 Agno、n8n、MCP、Agent Skills 与工具调用（Tool Calling）；编写内容 Skill，连接微信发布相关工具与 Supabase，使用 n8n 采集信息。</w:t>
       </w:r>
     </w:p>
     <w:p>
@@ -547,10 +547,10 @@
         <w:rPr>
           <w:b/>
         </w:rPr>
-        <w:t>多模态制作：</w:t>
+        <w:t>生成模型与应用：</w:t>
       </w:r>
       <w:r>
-        <w:t>Image 2.0、Midjourney、Seedance、ComfyUI / Redux；具备数字人口播、图像编辑及控图实践，使用 FFmpeg、Remotion、ElevenLabs。</w:t>
+        <w:t>围绕图像编辑、商品控图、数字人口播与视频制作选择工具；使用过 Image 2.0 / GPT Image、Midjourney、即梦、Seedance 2.0、海螺、Runway 等。</w:t>
       </w:r>
     </w:p>
     <w:p>
@@ -561,10 +561,24 @@
         <w:rPr>
           <w:b/>
         </w:rPr>
-        <w:t>视觉与设计基础：</w:t>
+        <w:t>开源工作流与训练实践：</w:t>
       </w:r>
       <w:r>
-        <w:t>Photoshop、3ds Max，电商主图、详情页及 3D 渲染；具备用户旅程、方案比较和人机工程基础。</w:t>
+        <w:t>搭建过 ComfyUI / Redux 工作流，使用过 Stable Diffusion 等开源图像工具；基础了解人脸 LoRA 训练，实践过素材整理、打标与基础训练流程。</w:t>
+      </w:r>
+    </w:p>
+    <w:p>
+      <w:pPr>
+        <w:keepLines/>
+      </w:pPr>
+      <w:r>
+        <w:rPr>
+          <w:b/>
+        </w:rPr>
+        <w:t>视觉与视频制作：</w:t>
+      </w:r>
+      <w:r>
+        <w:t>使用 Photoshop、3ds Max 制作电商图片与渲染素材；具备 Maya、Premiere Pro、After Effects 基础使用经验。使用 FFmpeg、Remotion、ElevenLabs 制作和处理视频、语音。</w:t>
       </w:r>
     </w:p>
     <w:p>
@@ -651,6 +665,112 @@
         </w:rPr>
         <w:tab/>
         <w:t>2017 - 2021</w:t>
+      </w:r>
+    </w:p>
+    <w:p>
+      <w:pPr>
+        <w:keepNext w:val="0"/>
+        <w:keepLines/>
+      </w:pPr>
+      <w:r>
+        <w:t>院学生会副主席；RT 舞社 Breaking 社长。参与组织校园活动与社团训练、演出。</w:t>
+      </w:r>
+    </w:p>
+    <w:p>
+      <w:pPr>
+        <w:pStyle w:val="Heading1"/>
+        <w:keepNext/>
+        <w:keepLines/>
+      </w:pPr>
+      <w:r>
+        <w:t>荣誉奖项</w:t>
+      </w:r>
+    </w:p>
+    <w:p>
+      <w:pPr>
+        <w:keepLines/>
+        <w:ind w:left="170" w:hanging="170"/>
+      </w:pPr>
+      <w:r>
+        <w:t xml:space="preserve">• </w:t>
+      </w:r>
+      <w:r>
+        <w:t>2025 年 24 小时超创赛｜心宙共鸣奖</w:t>
+      </w:r>
+    </w:p>
+    <w:p>
+      <w:pPr>
+        <w:keepLines/>
+        <w:ind w:left="170" w:hanging="170"/>
+      </w:pPr>
+      <w:r>
+        <w:t xml:space="preserve">• </w:t>
+      </w:r>
+      <w:r>
+        <w:t>2026 年 ACX 超创赛｜AI 先锋奖</w:t>
+      </w:r>
+    </w:p>
+    <w:p>
+      <w:pPr>
+        <w:keepLines/>
+        <w:ind w:left="170" w:hanging="170"/>
+      </w:pPr>
+      <w:r>
+        <w:t xml:space="preserve">• </w:t>
+      </w:r>
+      <w:r>
+        <w:t>人工智能与机器人创新大赛（河北赛区）｜一等奖</w:t>
+      </w:r>
+    </w:p>
+    <w:p>
+      <w:pPr>
+        <w:keepLines/>
+        <w:ind w:left="170" w:hanging="170"/>
+      </w:pPr>
+      <w:r>
+        <w:t xml:space="preserve">• </w:t>
+      </w:r>
+      <w:r>
+        <w:t>河北省第十届大学生工业设计创新大赛｜优秀奖</w:t>
+      </w:r>
+    </w:p>
+    <w:p>
+      <w:pPr>
+        <w:keepLines/>
+        <w:ind w:left="170" w:hanging="170"/>
+      </w:pPr>
+      <w:r>
+        <w:t xml:space="preserve">• </w:t>
+      </w:r>
+      <w:r>
+        <w:t>2019–2020 学年｜一等奖学金</w:t>
+      </w:r>
+    </w:p>
+    <w:p>
+      <w:pPr>
+        <w:keepLines/>
+        <w:ind w:left="170" w:hanging="170"/>
+      </w:pPr>
+      <w:r>
+        <w:t xml:space="preserve">• </w:t>
+      </w:r>
+      <w:r>
+        <w:t>2018–2019 学年｜优秀共青团员</w:t>
+      </w:r>
+    </w:p>
+    <w:p>
+      <w:pPr>
+        <w:keepNext w:val="0"/>
+        <w:keepLines/>
+      </w:pPr>
+      <w:r>
+        <w:rPr>
+          <w:b/>
+        </w:rPr>
+        <w:t>兴趣爱好：</w:t>
+      </w:r>
+      <w:r>
+        <w:t>唱歌、羽毛球、徒步</w:t>
       </w:r>
     </w:p>
     <w:sectPr>

</xml_diff>